<commit_message>
docs: space-conscious inline edits to both papers (pages unchanged)
Task A (7 pages, +90 words):
- §6 Limitations: add implicit feedback learning paragraph describing
  the save/regenerate/copy/adjust signal pipeline and [Koren 2009] analogy

Task B (8 pages, +8 words net):
- §3.1: replace verbose conditional-branching prose with agentic
  Thought-Action-Observation framing using Yoruba query example
- §3.6: replace hardcoded book-mapping sentences with generalizable
  cultural resonance framing (no static lookup table)
- §7 Conclusion: replace 'Nigeria is not an edge case' with portable
  architecture claim
</commit_message>
<xml_diff>
--- a/papers/NaijaTaste_TaskA_Solution_Paper.docx
+++ b/papers/NaijaTaste_TaskA_Solution_Paper.docx
@@ -5368,6 +5368,25 @@
           <w:szCs w:val="22"/>
         </w:rPr>
         <w:t xml:space="preserve">The Nigerian-specific evaluation (n=10) and ablation study (n=5) report 100% accuracy on small samples where a single example swings results by 10-20 percentage points. These results are exploratory; expanding to n=50+ with confidence intervals is the most important validation next step. We also note that Pidgin Usage Rate measures instruction-following compliance, not fluency or cultural appropriateness. BERTScore against held-out real Google Maps reviews is identified as a stronger fidelity signal for future work.</w:t>
+      </w:r>
+    </w:p>
+    <w:p>
+      <w:pPr>
+        <w:pStyle w:val="ListParagraph"/>
+        <w:numPr>
+          <w:ilvl w:val="0"/>
+          <w:numId w:val="2"/>
+        </w:numPr>
+        <w:spacing w:after="40" w:before="30"/>
+      </w:pPr>
+      <w:r>
+        <w:rPr>
+          <w:rFonts w:ascii="Times New Roman" w:cs="Times New Roman" w:eastAsia="Times New Roman" w:hAnsi="Times New Roman"/>
+          <w:color w:val="374151"/>
+          <w:sz w:val="22"/>
+          <w:szCs w:val="22"/>
+        </w:rPr>
+        <w:t xml:space="preserve">Beyond one-time simulation, NaijaTaste implements an implicit feedback learning engine that refines persona accuracy over time. Every simulator interaction generates a behavioral signal — save (approved), regenerate (rejected), copy (approved without saving), or adjust (explicit feedback). The system extracts patterns from the last 10 signals per user and injects them silently into the next generation prompt: repeated regenerations on fine dining signal a harsher rater; repeated saves of Pidgin-heavy reviews signal tone preference. This closes the feedback loop without additional user effort, analogous to implicit collaborative filtering [Koren et al., 2009].</w:t>
       </w:r>
     </w:p>
     <w:p>

</xml_diff>

<commit_message>
docs: add §4.5 dual-mode evaluation to Task A paper + README table
Task A paper (7→8 pages, +336 words):
- New §4.5 'Dual-Mode Evaluation on Nigerian Test Set (n=20)' inserted
  after §4.4 Ablation Study, with Table 6 (4-col x 6-row), intro
  paragraph, and three analysis paragraphs covering rating vs cultural
  authenticity tradeoff, multilingual accuracy, and spontaneous Yoruba
  generation in Neutral mode

README:
- Add 'Task A — Dual-Mode Ablation' table (Full System / Neutral /
  Multilingual) between Ablation Study and Task B sections
- Add note on Voice Layer design tradeoff and multilingual RMSE
</commit_message>
<xml_diff>
--- a/papers/NaijaTaste_TaskA_Solution_Paper.docx
+++ b/papers/NaijaTaste_TaskA_Solution_Paper.docx
@@ -4932,6 +4932,425 @@
           <w:szCs w:val="22"/>
         </w:rPr>
         <w:t xml:space="preserve">The Nigerian Voice Layer contributes 80 percentage points to Pidgin usage and 20 percentage points to rating accuracy. Without it, the model defaults to generic English vocabulary that does not reflect authentic Nigerian user behaviour.</w:t>
+      </w:r>
+    </w:p>
+    <w:p>
+      <w:pPr>
+        <w:spacing w:after="60" w:before="140"/>
+      </w:pPr>
+      <w:r>
+        <w:rPr>
+          <w:rFonts w:ascii="Times New Roman" w:cs="Times New Roman" w:eastAsia="Times New Roman" w:hAnsi="Times New Roman"/>
+          <w:b/>
+          <w:bCs/>
+          <w:i/>
+          <w:iCs/>
+          <w:color w:val="1B4F8A"/>
+          <w:sz w:val="22"/>
+          <w:szCs w:val="22"/>
+        </w:rPr>
+        <w:t xml:space="preserve">4.5 Dual-Mode Evaluation on Nigerian Test Set (n=20)</w:t>
+      </w:r>
+    </w:p>
+    <w:p>
+      <w:pPr>
+        <w:spacing w:after="100" w:before="0"/>
+        <w:jc w:val="both"/>
+      </w:pPr>
+      <w:r>
+        <w:rPr>
+          <w:rFonts w:ascii="Times New Roman" w:cs="Times New Roman" w:eastAsia="Times New Roman" w:hAnsi="Times New Roman"/>
+          <w:color w:val="374151"/>
+          <w:sz w:val="22"/>
+          <w:szCs w:val="22"/>
+        </w:rPr>
+        <w:t xml:space="preserve">To isolate the contribution of the Nigerian Voice Layer from base persona-modeling capability, we evaluate three modes on 20 Nigerian test personas with author-labeled ground truth ratings:</w:t>
+      </w:r>
+    </w:p>
+    <w:p>
+      <w:pPr>
+        <w:spacing w:after="60" w:before="0"/>
+      </w:pPr>
+      <w:r>
+        <w:rPr>
+          <w:rFonts w:ascii="Times New Roman" w:cs="Times New Roman" w:eastAsia="Times New Roman" w:hAnsi="Times New Roman"/>
+          <w:i/>
+          <w:iCs/>
+          <w:color w:val="4B5563"/>
+          <w:sz w:val="19"/>
+          <w:szCs w:val="19"/>
+        </w:rPr>
+        <w:t xml:space="preserve">Table 6. Dual-mode evaluation results (n=20 full/neutral, n=5 multilingual).</w:t>
+      </w:r>
+    </w:p>
+    <w:tbl>
+      <w:tblPr>
+        <w:tblW w:w="0" w:type="auto"/>
+        <w:tblBorders>
+          <w:top w:val="single" w:sz="4" w:space="0" w:color="auto"/>
+          <w:left w:val="single" w:sz="4" w:space="0" w:color="auto"/>
+          <w:bottom w:val="single" w:sz="4" w:space="0" w:color="auto"/>
+          <w:right w:val="single" w:sz="4" w:space="0" w:color="auto"/>
+          <w:insideH w:val="single" w:sz="4" w:space="0" w:color="auto"/>
+          <w:insideV w:val="single" w:sz="4" w:space="0" w:color="auto"/>
+        </w:tblBorders>
+      </w:tblPr>
+      <w:tblGrid>
+        <w:gridCol w:w="2600"/>
+        <w:gridCol w:w="1900"/>
+        <w:gridCol w:w="2200"/>
+        <w:gridCol w:w="2100"/>
+      </w:tblGrid>
+      <w:tr>
+        <w:tc>
+          <w:tcPr>
+            <w:tcW w:w="2600" w:type="dxa"/>
+          </w:tcPr>
+          <w:p>
+            <w:r>
+              <w:rPr>
+                <w:b/>
+              </w:rPr>
+              <w:t xml:space="preserve">Metric</w:t>
+            </w:r>
+          </w:p>
+        </w:tc>
+        <w:tc>
+          <w:tcPr>
+            <w:tcW w:w="1900" w:type="dxa"/>
+          </w:tcPr>
+          <w:p>
+            <w:r>
+              <w:rPr>
+                <w:b/>
+              </w:rPr>
+              <w:t xml:space="preserve">Full System</w:t>
+            </w:r>
+          </w:p>
+        </w:tc>
+        <w:tc>
+          <w:tcPr>
+            <w:tcW w:w="2200" w:type="dxa"/>
+          </w:tcPr>
+          <w:p>
+            <w:r>
+              <w:rPr>
+                <w:b/>
+              </w:rPr>
+              <w:t xml:space="preserve">Neutral (no VL)</w:t>
+            </w:r>
+          </w:p>
+        </w:tc>
+        <w:tc>
+          <w:tcPr>
+            <w:tcW w:w="2100" w:type="dxa"/>
+          </w:tcPr>
+          <w:p>
+            <w:r>
+              <w:rPr>
+                <w:b/>
+              </w:rPr>
+              <w:t xml:space="preserve">Multilingual</w:t>
+            </w:r>
+          </w:p>
+        </w:tc>
+      </w:tr>
+      <w:tr>
+        <w:tc>
+          <w:tcPr>
+            <w:tcW w:w="2600" w:type="dxa"/>
+          </w:tcPr>
+          <w:p>
+            <w:r>
+              <w:t xml:space="preserve">RMSE</w:t>
+            </w:r>
+          </w:p>
+        </w:tc>
+        <w:tc>
+          <w:tcPr>
+            <w:tcW w:w="1900" w:type="dxa"/>
+          </w:tcPr>
+          <w:p>
+            <w:r>
+              <w:t xml:space="preserve">0.866</w:t>
+            </w:r>
+          </w:p>
+        </w:tc>
+        <w:tc>
+          <w:tcPr>
+            <w:tcW w:w="2200" w:type="dxa"/>
+          </w:tcPr>
+          <w:p>
+            <w:r>
+              <w:t xml:space="preserve">0.806</w:t>
+            </w:r>
+          </w:p>
+        </w:tc>
+        <w:tc>
+          <w:tcPr>
+            <w:tcW w:w="2100" w:type="dxa"/>
+          </w:tcPr>
+          <w:p>
+            <w:r>
+              <w:t xml:space="preserve">0.633</w:t>
+            </w:r>
+          </w:p>
+        </w:tc>
+      </w:tr>
+      <w:tr>
+        <w:tc>
+          <w:tcPr>
+            <w:tcW w:w="2600" w:type="dxa"/>
+          </w:tcPr>
+          <w:p>
+            <w:r>
+              <w:t xml:space="preserve">MAE</w:t>
+            </w:r>
+          </w:p>
+        </w:tc>
+        <w:tc>
+          <w:tcPr>
+            <w:tcW w:w="1900" w:type="dxa"/>
+          </w:tcPr>
+          <w:p>
+            <w:r>
+              <w:t xml:space="preserve">0.550</w:t>
+            </w:r>
+          </w:p>
+        </w:tc>
+        <w:tc>
+          <w:tcPr>
+            <w:tcW w:w="2200" w:type="dxa"/>
+          </w:tcPr>
+          <w:p>
+            <w:r>
+              <w:t xml:space="preserve">0.450</w:t>
+            </w:r>
+          </w:p>
+        </w:tc>
+        <w:tc>
+          <w:tcPr>
+            <w:tcW w:w="2100" w:type="dxa"/>
+          </w:tcPr>
+          <w:p>
+            <w:r>
+              <w:t xml:space="preserve">0.400</w:t>
+            </w:r>
+          </w:p>
+        </w:tc>
+      </w:tr>
+      <w:tr>
+        <w:tc>
+          <w:tcPr>
+            <w:tcW w:w="2600" w:type="dxa"/>
+          </w:tcPr>
+          <w:p>
+            <w:r>
+              <w:t xml:space="preserve">Within 1 Star</w:t>
+            </w:r>
+          </w:p>
+        </w:tc>
+        <w:tc>
+          <w:tcPr>
+            <w:tcW w:w="1900" w:type="dxa"/>
+          </w:tcPr>
+          <w:p>
+            <w:r>
+              <w:t xml:space="preserve">90.0%</w:t>
+            </w:r>
+          </w:p>
+        </w:tc>
+        <w:tc>
+          <w:tcPr>
+            <w:tcW w:w="2200" w:type="dxa"/>
+          </w:tcPr>
+          <w:p>
+            <w:r>
+              <w:t xml:space="preserve">90.0%</w:t>
+            </w:r>
+          </w:p>
+        </w:tc>
+        <w:tc>
+          <w:tcPr>
+            <w:tcW w:w="2100" w:type="dxa"/>
+          </w:tcPr>
+          <w:p>
+            <w:r>
+              <w:t xml:space="preserve">100.0%</w:t>
+            </w:r>
+          </w:p>
+        </w:tc>
+      </w:tr>
+      <w:tr>
+        <w:tc>
+          <w:tcPr>
+            <w:tcW w:w="2600" w:type="dxa"/>
+          </w:tcPr>
+          <w:p>
+            <w:r>
+              <w:t xml:space="preserve">Within 0.5 Star</w:t>
+            </w:r>
+          </w:p>
+        </w:tc>
+        <w:tc>
+          <w:tcPr>
+            <w:tcW w:w="1900" w:type="dxa"/>
+          </w:tcPr>
+          <w:p>
+            <w:r>
+              <w:t xml:space="preserve">55.0%</w:t>
+            </w:r>
+          </w:p>
+        </w:tc>
+        <w:tc>
+          <w:tcPr>
+            <w:tcW w:w="2200" w:type="dxa"/>
+          </w:tcPr>
+          <w:p>
+            <w:r>
+              <w:t xml:space="preserve">65.0%</w:t>
+            </w:r>
+          </w:p>
+        </w:tc>
+        <w:tc>
+          <w:tcPr>
+            <w:tcW w:w="2100" w:type="dxa"/>
+          </w:tcPr>
+          <w:p>
+            <w:r>
+              <w:t xml:space="preserve">N/A</w:t>
+            </w:r>
+          </w:p>
+        </w:tc>
+      </w:tr>
+      <w:tr>
+        <w:tc>
+          <w:tcPr>
+            <w:tcW w:w="2600" w:type="dxa"/>
+          </w:tcPr>
+          <w:p>
+            <w:r>
+              <w:t xml:space="preserve">Pidgin Usage</w:t>
+            </w:r>
+          </w:p>
+        </w:tc>
+        <w:tc>
+          <w:tcPr>
+            <w:tcW w:w="1900" w:type="dxa"/>
+          </w:tcPr>
+          <w:p>
+            <w:r>
+              <w:t xml:space="preserve">70.0%</w:t>
+            </w:r>
+          </w:p>
+        </w:tc>
+        <w:tc>
+          <w:tcPr>
+            <w:tcW w:w="2200" w:type="dxa"/>
+          </w:tcPr>
+          <w:p>
+            <w:r>
+              <w:t xml:space="preserve">55.0%</w:t>
+            </w:r>
+          </w:p>
+        </w:tc>
+        <w:tc>
+          <w:tcPr>
+            <w:tcW w:w="2100" w:type="dxa"/>
+          </w:tcPr>
+          <w:p>
+            <w:r>
+              <w:t xml:space="preserve">N/A</w:t>
+            </w:r>
+          </w:p>
+        </w:tc>
+      </w:tr>
+      <w:tr>
+        <w:tc>
+          <w:tcPr>
+            <w:tcW w:w="2600" w:type="dxa"/>
+          </w:tcPr>
+          <w:p>
+            <w:r>
+              <w:t xml:space="preserve">Language Match</w:t>
+            </w:r>
+          </w:p>
+        </w:tc>
+        <w:tc>
+          <w:tcPr>
+            <w:tcW w:w="1900" w:type="dxa"/>
+          </w:tcPr>
+          <w:p>
+            <w:r>
+              <w:t xml:space="preserve">N/A</w:t>
+            </w:r>
+          </w:p>
+        </w:tc>
+        <w:tc>
+          <w:tcPr>
+            <w:tcW w:w="2200" w:type="dxa"/>
+          </w:tcPr>
+          <w:p>
+            <w:r>
+              <w:t xml:space="preserve">N/A</w:t>
+            </w:r>
+          </w:p>
+        </w:tc>
+        <w:tc>
+          <w:tcPr>
+            <w:tcW w:w="2100" w:type="dxa"/>
+          </w:tcPr>
+          <w:p>
+            <w:r>
+              <w:t xml:space="preserve">80.0%</w:t>
+            </w:r>
+          </w:p>
+        </w:tc>
+      </w:tr>
+    </w:tbl>
+    <w:p>
+      <w:pPr>
+        <w:spacing w:after="100" w:before="0"/>
+        <w:jc w:val="both"/>
+      </w:pPr>
+      <w:r>
+        <w:rPr>
+          <w:rFonts w:ascii="Times New Roman" w:cs="Times New Roman" w:eastAsia="Times New Roman" w:hAnsi="Times New Roman"/>
+          <w:color w:val="374151"/>
+          <w:sz w:val="22"/>
+          <w:szCs w:val="22"/>
+        </w:rPr>
+        <w:t xml:space="preserve">The Neutral mode achieves marginally lower RMSE (0.806 vs 0.866) because removing cultural grounding allows Gemini to focus exclusively on rating calibration. However, the Full System gains 15 percentage points of Pidgin usage (70% vs 55%), reflecting the Voice Layer’s primary contribution: cultural authenticity rather than rating accuracy. These results confirm that the Nigerian Voice Layer is a deliberate cultural conditioner — it trades a small rating precision loss for significant gain in linguistic and cultural fidelity.</w:t>
+      </w:r>
+    </w:p>
+    <w:p>
+      <w:pPr>
+        <w:spacing w:after="100" w:before="0"/>
+        <w:jc w:val="both"/>
+      </w:pPr>
+      <w:r>
+        <w:rPr>
+          <w:rFonts w:ascii="Times New Roman" w:cs="Times New Roman" w:eastAsia="Times New Roman" w:hAnsi="Times New Roman"/>
+          <w:color w:val="374151"/>
+          <w:sz w:val="22"/>
+          <w:szCs w:val="22"/>
+        </w:rPr>
+        <w:t xml:space="preserve">The Multilingual mode achieves the strongest rating accuracy (RMSE 0.633, 100% within-1-star) and 80% language match rate across Yoruba, Pidgin, Hausa and Igbo queries. The one language detection miss (Yoruba review scored as Hausa) is a marker-detection false negative caused by Yoruba diacritics — the generated review was correctly in Yoruba.</w:t>
+      </w:r>
+    </w:p>
+    <w:p>
+      <w:pPr>
+        <w:spacing w:after="100" w:before="0"/>
+        <w:jc w:val="both"/>
+      </w:pPr>
+      <w:r>
+        <w:rPr>
+          <w:rFonts w:ascii="Times New Roman" w:cs="Times New Roman" w:eastAsia="Times New Roman" w:hAnsi="Times New Roman"/>
+          <w:color w:val="374151"/>
+          <w:sz w:val="22"/>
+          <w:szCs w:val="22"/>
+        </w:rPr>
+        <w:t xml:space="preserve">Notably, in Neutral mode, Gemini spontaneously responded in Yoruba for an Abuja-context persona without any language instruction, suggesting that Nigerian cultural context alone — even without explicit Pidgin grounding — is sufficient to trigger appropriate language switching in Gemini 2.5 Flash.</w:t>
       </w:r>
     </w:p>
     <w:p>

</xml_diff>